<commit_message>
Botão enviar do chat do Linkedin nao aparecia devido a resolução, alterações para rolar o container da janela do chat flutuante.
</commit_message>
<xml_diff>
--- a/docs/Criar credenciais do service account.docx
+++ b/docs/Criar credenciais do service account.docx
@@ -26,7 +26,7 @@
         </w:rPr>
         <w:t xml:space="preserve">Acesse </w:t>
       </w:r>
-      <w:hyperlink r:id="rId6">
+      <w:hyperlink r:id="rId7">
         <w:r>
           <w:rPr>
             <w:color w:val="1155cc"/>
@@ -50,6 +50,7 @@
           <w:numId w:val="2"/>
         </w:numPr>
         <w:ind w:left="720" w:hanging="360"/>
+        <w:rPr/>
       </w:pPr>
       <w:r>
         <w:rPr>
@@ -63,6 +64,11 @@
           <w:rtl w:val="0"/>
         </w:rPr>
         <w:t xml:space="preserve">Selecione um projeto &gt; Novo projeto</w:t>
+      </w:r>
+      <w:r>
+        <w:rPr>
+          <w:rtl w:val="0"/>
+        </w:rPr>
       </w:r>
     </w:p>
     <w:p>
@@ -75,7 +81,7 @@
           <wp:inline distB="114300" distT="114300" distL="114300" distR="114300">
             <wp:extent cx="6519863" cy="3522225"/>
             <wp:effectExtent b="0" l="0" r="0" t="0"/>
-            <wp:docPr id="2" name="image2.png"/>
+            <wp:docPr id="6" name="image2.png"/>
             <a:graphic>
               <a:graphicData uri="http://schemas.openxmlformats.org/drawingml/2006/picture">
                 <pic:pic>
@@ -84,7 +90,7 @@
                     <pic:cNvPicPr preferRelativeResize="0"/>
                   </pic:nvPicPr>
                   <pic:blipFill>
-                    <a:blip r:embed="rId7"/>
+                    <a:blip r:embed="rId8"/>
                     <a:srcRect b="0" l="0" r="0" t="0"/>
                     <a:stretch>
                       <a:fillRect/>
@@ -127,6 +133,7 @@
           <w:numId w:val="2"/>
         </w:numPr>
         <w:ind w:left="720" w:hanging="360"/>
+        <w:rPr/>
       </w:pPr>
       <w:r>
         <w:rPr>
@@ -199,16 +206,16 @@
           <wp:inline distB="114300" distT="114300" distL="114300" distR="114300">
             <wp:extent cx="5186363" cy="6168036"/>
             <wp:effectExtent b="0" l="0" r="0" t="0"/>
-            <wp:docPr id="5" name="image1.png"/>
+            <wp:docPr id="8" name="image5.png"/>
             <a:graphic>
               <a:graphicData uri="http://schemas.openxmlformats.org/drawingml/2006/picture">
                 <pic:pic>
                   <pic:nvPicPr>
-                    <pic:cNvPr id="0" name="image1.png"/>
+                    <pic:cNvPr id="0" name="image5.png"/>
                     <pic:cNvPicPr preferRelativeResize="0"/>
                   </pic:nvPicPr>
                   <pic:blipFill>
-                    <a:blip r:embed="rId8"/>
+                    <a:blip r:embed="rId9"/>
                     <a:srcRect b="0" l="0" r="0" t="0"/>
                     <a:stretch>
                       <a:fillRect/>
@@ -304,6 +311,11 @@
         </w:rPr>
         <w:t xml:space="preserve"> (recomendado para leitura/escrita e permissões)</w:t>
       </w:r>
+      <w:r>
+        <w:rPr>
+          <w:rtl w:val="0"/>
+        </w:rPr>
+      </w:r>
     </w:p>
     <w:p>
       <w:pPr>
@@ -356,7 +368,7 @@
           <w:b w:val="1"/>
           <w:rtl w:val="0"/>
         </w:rPr>
-        <w:t xml:space="preserve">IAM &amp; Admin &gt; Contas de serviço</w:t>
+        <w:t xml:space="preserve">IAM e Admin &gt; Contas de serviço</w:t>
       </w:r>
     </w:p>
     <w:p>
@@ -369,16 +381,16 @@
           <wp:inline distB="114300" distT="114300" distL="114300" distR="114300">
             <wp:extent cx="4281488" cy="4680253"/>
             <wp:effectExtent b="0" l="0" r="0" t="0"/>
-            <wp:docPr id="3" name="image5.png"/>
+            <wp:docPr id="7" name="image3.png"/>
             <a:graphic>
               <a:graphicData uri="http://schemas.openxmlformats.org/drawingml/2006/picture">
                 <pic:pic>
                   <pic:nvPicPr>
-                    <pic:cNvPr id="0" name="image5.png"/>
+                    <pic:cNvPr id="0" name="image3.png"/>
                     <pic:cNvPicPr preferRelativeResize="0"/>
                   </pic:nvPicPr>
                   <pic:blipFill>
-                    <a:blip r:embed="rId9"/>
+                    <a:blip r:embed="rId10"/>
                     <a:srcRect b="0" l="0" r="0" t="0"/>
                     <a:stretch>
                       <a:fillRect/>
@@ -438,6 +450,11 @@
         </w:rPr>
         <w:t xml:space="preserve">Criar conta de serviço</w:t>
       </w:r>
+      <w:r>
+        <w:rPr>
+          <w:rtl w:val="0"/>
+        </w:rPr>
+      </w:r>
     </w:p>
     <w:p>
       <w:pPr>
@@ -466,16 +483,16 @@
           <wp:inline distB="114300" distT="114300" distL="114300" distR="114300">
             <wp:extent cx="3948113" cy="4082402"/>
             <wp:effectExtent b="0" l="0" r="0" t="0"/>
-            <wp:docPr id="1" name="image3.png"/>
+            <wp:docPr id="10" name="image4.png"/>
             <a:graphic>
               <a:graphicData uri="http://schemas.openxmlformats.org/drawingml/2006/picture">
                 <pic:pic>
                   <pic:nvPicPr>
-                    <pic:cNvPr id="0" name="image3.png"/>
+                    <pic:cNvPr id="0" name="image4.png"/>
                     <pic:cNvPicPr preferRelativeResize="0"/>
                   </pic:nvPicPr>
                   <pic:blipFill>
-                    <a:blip r:embed="rId10"/>
+                    <a:blip r:embed="rId11"/>
                     <a:srcRect b="0" l="0" r="0" t="0"/>
                     <a:stretch>
                       <a:fillRect/>
@@ -555,6 +572,11 @@
         </w:rPr>
         <w:t xml:space="preserve">.</w:t>
       </w:r>
+      <w:r>
+        <w:rPr>
+          <w:rtl w:val="0"/>
+        </w:rPr>
+      </w:r>
     </w:p>
     <w:p>
       <w:pPr>
@@ -577,13 +599,21 @@
           <w:u w:val="none"/>
         </w:rPr>
       </w:pPr>
-      <w:r>
-        <w:rPr>
-          <w:rFonts w:ascii="Arial Unicode MS" w:cs="Arial Unicode MS" w:eastAsia="Arial Unicode MS" w:hAnsi="Arial Unicode MS"/>
-          <w:rtl w:val="0"/>
-        </w:rPr>
-        <w:t xml:space="preserve">Na lista de service accounts, clique na que você criou → </w:t>
-      </w:r>
+      <w:sdt>
+        <w:sdtPr>
+          <w:id w:val="-65276848"/>
+          <w:tag w:val="goog_rdk_0"/>
+        </w:sdtPr>
+        <w:sdtContent>
+          <w:r>
+            <w:rPr>
+              <w:rFonts w:ascii="Arial Unicode MS" w:cs="Arial Unicode MS" w:eastAsia="Arial Unicode MS" w:hAnsi="Arial Unicode MS"/>
+              <w:rtl w:val="0"/>
+            </w:rPr>
+            <w:t xml:space="preserve">Na lista de service accounts, clique na que você criou → </w:t>
+          </w:r>
+        </w:sdtContent>
+      </w:sdt>
       <w:r>
         <w:rPr>
           <w:b w:val="1"/>
@@ -591,13 +621,21 @@
         </w:rPr>
         <w:t xml:space="preserve">Gerenciar chaves</w:t>
       </w:r>
-      <w:r>
-        <w:rPr>
-          <w:rFonts w:ascii="Arial Unicode MS" w:cs="Arial Unicode MS" w:eastAsia="Arial Unicode MS" w:hAnsi="Arial Unicode MS"/>
-          <w:rtl w:val="0"/>
-        </w:rPr>
-        <w:t xml:space="preserve"> → </w:t>
-      </w:r>
+      <w:sdt>
+        <w:sdtPr>
+          <w:id w:val="-1814410675"/>
+          <w:tag w:val="goog_rdk_1"/>
+        </w:sdtPr>
+        <w:sdtContent>
+          <w:r>
+            <w:rPr>
+              <w:rFonts w:ascii="Arial Unicode MS" w:cs="Arial Unicode MS" w:eastAsia="Arial Unicode MS" w:hAnsi="Arial Unicode MS"/>
+              <w:rtl w:val="0"/>
+            </w:rPr>
+            <w:t xml:space="preserve"> → </w:t>
+          </w:r>
+        </w:sdtContent>
+      </w:sdt>
       <w:r>
         <w:rPr>
           <w:b w:val="1"/>
@@ -605,13 +643,21 @@
         </w:rPr>
         <w:t xml:space="preserve">Adicionar chaves</w:t>
       </w:r>
-      <w:r>
-        <w:rPr>
-          <w:rFonts w:ascii="Arial Unicode MS" w:cs="Arial Unicode MS" w:eastAsia="Arial Unicode MS" w:hAnsi="Arial Unicode MS"/>
-          <w:rtl w:val="0"/>
-        </w:rPr>
-        <w:t xml:space="preserve"> → </w:t>
-      </w:r>
+      <w:sdt>
+        <w:sdtPr>
+          <w:id w:val="703156548"/>
+          <w:tag w:val="goog_rdk_2"/>
+        </w:sdtPr>
+        <w:sdtContent>
+          <w:r>
+            <w:rPr>
+              <w:rFonts w:ascii="Arial Unicode MS" w:cs="Arial Unicode MS" w:eastAsia="Arial Unicode MS" w:hAnsi="Arial Unicode MS"/>
+              <w:rtl w:val="0"/>
+            </w:rPr>
+            <w:t xml:space="preserve"> → </w:t>
+          </w:r>
+        </w:sdtContent>
+      </w:sdt>
       <w:r>
         <w:rPr>
           <w:b w:val="1"/>
@@ -619,13 +665,21 @@
         </w:rPr>
         <w:t xml:space="preserve">Criar nova chave</w:t>
       </w:r>
-      <w:r>
-        <w:rPr>
-          <w:rFonts w:ascii="Arial Unicode MS" w:cs="Arial Unicode MS" w:eastAsia="Arial Unicode MS" w:hAnsi="Arial Unicode MS"/>
-          <w:rtl w:val="0"/>
-        </w:rPr>
-        <w:t xml:space="preserve"> → escolha </w:t>
-      </w:r>
+      <w:sdt>
+        <w:sdtPr>
+          <w:id w:val="-452054218"/>
+          <w:tag w:val="goog_rdk_3"/>
+        </w:sdtPr>
+        <w:sdtContent>
+          <w:r>
+            <w:rPr>
+              <w:rFonts w:ascii="Arial Unicode MS" w:cs="Arial Unicode MS" w:eastAsia="Arial Unicode MS" w:hAnsi="Arial Unicode MS"/>
+              <w:rtl w:val="0"/>
+            </w:rPr>
+            <w:t xml:space="preserve"> → escolha </w:t>
+          </w:r>
+        </w:sdtContent>
+      </w:sdt>
       <w:r>
         <w:rPr>
           <w:b w:val="1"/>
@@ -633,13 +687,21 @@
         </w:rPr>
         <w:t xml:space="preserve">JSON</w:t>
       </w:r>
-      <w:r>
-        <w:rPr>
-          <w:rFonts w:ascii="Arial Unicode MS" w:cs="Arial Unicode MS" w:eastAsia="Arial Unicode MS" w:hAnsi="Arial Unicode MS"/>
-          <w:rtl w:val="0"/>
-        </w:rPr>
-        <w:t xml:space="preserve"> → </w:t>
-      </w:r>
+      <w:sdt>
+        <w:sdtPr>
+          <w:id w:val="1934926572"/>
+          <w:tag w:val="goog_rdk_4"/>
+        </w:sdtPr>
+        <w:sdtContent>
+          <w:r>
+            <w:rPr>
+              <w:rFonts w:ascii="Arial Unicode MS" w:cs="Arial Unicode MS" w:eastAsia="Arial Unicode MS" w:hAnsi="Arial Unicode MS"/>
+              <w:rtl w:val="0"/>
+            </w:rPr>
+            <w:t xml:space="preserve"> → </w:t>
+          </w:r>
+        </w:sdtContent>
+      </w:sdt>
       <w:r>
         <w:rPr>
           <w:b w:val="1"/>
@@ -664,16 +726,16 @@
           <wp:inline distB="114300" distT="114300" distL="114300" distR="114300">
             <wp:extent cx="8567738" cy="2663772"/>
             <wp:effectExtent b="0" l="0" r="0" t="0"/>
-            <wp:docPr id="4" name="image4.png"/>
+            <wp:docPr id="9" name="image1.png"/>
             <a:graphic>
               <a:graphicData uri="http://schemas.openxmlformats.org/drawingml/2006/picture">
                 <pic:pic>
                   <pic:nvPicPr>
-                    <pic:cNvPr id="0" name="image4.png"/>
+                    <pic:cNvPr id="0" name="image1.png"/>
                     <pic:cNvPicPr preferRelativeResize="0"/>
                   </pic:nvPicPr>
                   <pic:blipFill>
-                    <a:blip r:embed="rId11"/>
+                    <a:blip r:embed="rId12"/>
                     <a:srcRect b="0" l="0" r="0" t="0"/>
                     <a:stretch>
                       <a:fillRect/>
@@ -748,6 +810,11 @@
         </w:rPr>
         <w:t xml:space="preserve">Guarde-o</w:t>
       </w:r>
+      <w:r>
+        <w:rPr>
+          <w:rtl w:val="0"/>
+        </w:rPr>
+      </w:r>
     </w:p>
     <w:p>
       <w:pPr>
@@ -865,6 +932,11 @@
         </w:rPr>
         <w:t xml:space="preserve">Editor</w:t>
       </w:r>
+      <w:r>
+        <w:rPr>
+          <w:rtl w:val="0"/>
+        </w:rPr>
+      </w:r>
     </w:p>
     <w:p>
       <w:pPr>
@@ -882,6 +954,11 @@
           <w:rtl w:val="0"/>
         </w:rPr>
         <w:t xml:space="preserve">Salve</w:t>
+      </w:r>
+      <w:r>
+        <w:rPr>
+          <w:rtl w:val="0"/>
+        </w:rPr>
       </w:r>
     </w:p>
     <w:p>
@@ -1896,6 +1973,20 @@
       <w:sz w:val="52"/>
       <w:szCs w:val="52"/>
     </w:rPr>
+  </w:style>
+  <w:style w:type="table" w:styleId="TableNormal" w:default="1">
+    <w:name w:val="TableNormal"/>
+    <w:tblPr>
+      <w:tblCellMar>
+        <w:top w:w="100.0" w:type="dxa"/>
+        <w:left w:w="100.0" w:type="dxa"/>
+        <w:bottom w:w="100.0" w:type="dxa"/>
+        <w:right w:w="100.0" w:type="dxa"/>
+      </w:tblCellMar>
+    </w:tblPr>
+  </w:style>
+  <w:style w:type="paragraph" w:styleId="Normal" w:default="1">
+    <w:name w:val="normal"/>
   </w:style>
   <w:style w:type="paragraph" w:styleId="Subtitle">
     <w:name w:val="Subtitle"/>
@@ -2236,4 +2327,19 @@
   </a:objectDefaults>
   <a:extraClrSchemeLst/>
 </a:theme>
+</file>
+
+<file path=customXML/item1.xml><?xml version="1.0" encoding="utf-8"?>
+<go:gDocsCustomXmlDataStorage xmlns:go="http://customooxmlschemas.google.com/" xmlns:r="http://schemas.openxmlformats.org/officeDocument/2006/relationships" uri="GoogleDocsCustomDataVersion2">
+  <go:docsCustomData xmlns:go="http://customooxmlschemas.google.com/" roundtripDataSignature="AMtx7miM8afqSc+K7Yvhs/Fdus3Qm1+9Mg==">CgMxLjAaJAoBMBIfCh0IB0IZCgVBcmltbxIQQXJpYWwgVW5pY29kZSBNUxokCgExEh8KHQgHQhkKBUFyaW1vEhBBcmlhbCBVbmljb2RlIE1TGiQKATISHwodCAdCGQoFQXJpbW8SEEFyaWFsIFVuaWNvZGUgTVMaJAoBMxIfCh0IB0IZCgVBcmltbxIQQXJpYWwgVW5pY29kZSBNUxokCgE0Eh8KHQgHQhkKBUFyaW1vEhBBcmlhbCBVbmljb2RlIE1TOAByITFvYkh5YkxqbHNKZVdOSTNpT3FUdWRtMTUwOVZpcDdyTw==</go:docsCustomData>
+</go:gDocsCustomXmlDataStorage>
+</file>
+
+<file path=customXML/itemProps1.xml><?xml version="1.0" encoding="utf-8"?>
+<ds:datastoreItem xmlns:ds="http://schemas.openxmlformats.org/officeDocument/2006/customXml" ds:itemID="{11111111-1234-1234-1234-123412341234}">
+  <ds:schemaRefs>
+    <ds:schemaRef ds:uri="http://schemas.openxmlformats.org/officeDocument/2006/relationships"/>
+    <ds:schemaRef ds:uri="http://customooxmlschemas.google.com/"/>
+  </ds:schemaRefs>
+</ds:datastoreItem>
 </file>
</xml_diff>